<commit_message>
all 3.5 resumes verified
</commit_message>
<xml_diff>
--- a/smit-aimlds.docx
+++ b/smit-aimlds.docx
@@ -578,7 +578,25 @@
                 <w:szCs w:val="20"/>
                 <w:lang w:val="en-US"/>
               </w:rPr>
-              <w:t>97.54%ile</w:t>
+              <w:t>97.</w:t>
+            </w:r>
+            <w:r>
+              <w:rPr>
+                <w:rFonts w:ascii="Calibri" w:hAnsi="Calibri" w:cs="Calibri"/>
+                <w:sz w:val="20"/>
+                <w:szCs w:val="20"/>
+                <w:lang w:val="en-US"/>
+              </w:rPr>
+              <w:t>6</w:t>
+            </w:r>
+            <w:r>
+              <w:rPr>
+                <w:rFonts w:ascii="Calibri" w:hAnsi="Calibri" w:cs="Calibri"/>
+                <w:sz w:val="20"/>
+                <w:szCs w:val="20"/>
+                <w:lang w:val="en-US"/>
+              </w:rPr>
+              <w:t>4%ile</w:t>
             </w:r>
           </w:p>
         </w:tc>
@@ -1991,7 +2009,6 @@
               </w:rPr>
               <w:t xml:space="preserve"> analytics infrastructure for Sarvam Samvaad, an enterprise conversational AI </w:t>
             </w:r>
-            <w:proofErr w:type="gramStart"/>
             <w:r>
               <w:rPr>
                 <w:rFonts w:ascii="Calibri" w:hAnsi="Calibri" w:cs="Calibri"/>
@@ -2003,7 +2020,6 @@
               </w:rPr>
               <w:t>agents</w:t>
             </w:r>
-            <w:proofErr w:type="gramEnd"/>
             <w:r>
               <w:rPr>
                 <w:rFonts w:ascii="Calibri" w:hAnsi="Calibri" w:cs="Calibri"/>
@@ -4019,25 +4035,7 @@
                 <w:sz w:val="20"/>
                 <w:szCs w:val="20"/>
               </w:rPr>
-              <w:t xml:space="preserve"> recognition using </w:t>
-            </w:r>
-            <w:proofErr w:type="spellStart"/>
-            <w:r>
-              <w:rPr>
-                <w:rFonts w:ascii="Calibri" w:hAnsi="Calibri" w:cs="Calibri"/>
-                <w:sz w:val="20"/>
-                <w:szCs w:val="20"/>
-              </w:rPr>
-              <w:t>dlib's</w:t>
-            </w:r>
-            <w:proofErr w:type="spellEnd"/>
-            <w:r>
-              <w:rPr>
-                <w:rFonts w:ascii="Calibri" w:hAnsi="Calibri" w:cs="Calibri"/>
-                <w:sz w:val="20"/>
-                <w:szCs w:val="20"/>
-              </w:rPr>
-              <w:t xml:space="preserve"> 128-dimensional </w:t>
+              <w:t xml:space="preserve"> recognition using dlib's 128-dimensional </w:t>
             </w:r>
             <w:r>
               <w:rPr>
@@ -4057,7 +4055,6 @@
               </w:rPr>
               <w:t xml:space="preserve">, indexed in PostgreSQL </w:t>
             </w:r>
-            <w:proofErr w:type="spellStart"/>
             <w:r>
               <w:rPr>
                 <w:rFonts w:ascii="Calibri" w:hAnsi="Calibri" w:cs="Calibri"/>
@@ -4078,7 +4075,6 @@
               </w:rPr>
               <w:t>r</w:t>
             </w:r>
-            <w:proofErr w:type="spellEnd"/>
           </w:p>
           <w:p>
             <w:pPr>
@@ -4207,29 +4203,7 @@
                 <w:sz w:val="20"/>
                 <w:szCs w:val="20"/>
               </w:rPr>
-              <w:t xml:space="preserve">time-limited </w:t>
-            </w:r>
-            <w:proofErr w:type="spellStart"/>
-            <w:r>
-              <w:rPr>
-                <w:rFonts w:ascii="Calibri" w:hAnsi="Calibri" w:cs="Calibri"/>
-                <w:b/>
-                <w:bCs/>
-                <w:sz w:val="20"/>
-                <w:szCs w:val="20"/>
-              </w:rPr>
-              <w:t>presigned</w:t>
-            </w:r>
-            <w:proofErr w:type="spellEnd"/>
-            <w:r>
-              <w:rPr>
-                <w:rFonts w:ascii="Calibri" w:hAnsi="Calibri" w:cs="Calibri"/>
-                <w:b/>
-                <w:bCs/>
-                <w:sz w:val="20"/>
-                <w:szCs w:val="20"/>
-              </w:rPr>
-              <w:t xml:space="preserve"> URLs</w:t>
+              <w:t>time-limited presigned URLs</w:t>
             </w:r>
             <w:r>
               <w:rPr>

</xml_diff>